<commit_message>
added lab7, change in cash size lab9
</commit_message>
<xml_diff>
--- a/отчёт lab8.docx
+++ b/отчёт lab8.docx
@@ -1629,8 +1629,6 @@
           </wp:inline>
         </w:drawing>
       </w:r>
-      <w:bookmarkStart w:id="0" w:name="_GoBack"/>
-      <w:bookmarkEnd w:id="0"/>
     </w:p>
     <w:p>
       <w:pPr>
@@ -1683,18 +1681,7 @@
           <w:shd w:val="clear" w:color="auto" w:fill="FFFFFF"/>
           <w:lang w:val="ru-RU"/>
         </w:rPr>
-        <w:t>19</w:t>
-      </w:r>
-      <w:r>
-        <w:rPr>
-          <w:rFonts w:ascii="Times New Roman" w:eastAsia="Segoe UI" w:hAnsi="Times New Roman" w:cs="Times New Roman"/>
-          <w:color w:val="0F1115"/>
-          <w:sz w:val="32"/>
-          <w:szCs w:val="32"/>
-          <w:shd w:val="clear" w:color="auto" w:fill="FFFFFF"/>
-          <w:lang w:val="ru-RU"/>
-        </w:rPr>
-        <w:t>2</w:t>
+        <w:t>48</w:t>
       </w:r>
       <w:r>
         <w:rPr>
@@ -1735,28 +1722,7 @@
           <w:shd w:val="clear" w:color="auto" w:fill="FFFFFF"/>
           <w:lang w:val="ru-RU"/>
         </w:rPr>
-        <w:t>2</w:t>
-      </w:r>
-      <w:r>
-        <w:rPr>
-          <w:rFonts w:ascii="Times New Roman" w:eastAsia="Segoe UI" w:hAnsi="Times New Roman" w:cs="Times New Roman"/>
-          <w:color w:val="0F1115"/>
-          <w:sz w:val="32"/>
-          <w:szCs w:val="32"/>
-          <w:shd w:val="clear" w:color="auto" w:fill="FFFFFF"/>
-        </w:rPr>
-        <w:t xml:space="preserve"> </w:t>
-      </w:r>
-      <w:r>
-        <w:rPr>
-          <w:rFonts w:ascii="Times New Roman" w:eastAsia="Segoe UI" w:hAnsi="Times New Roman" w:cs="Times New Roman"/>
-          <w:color w:val="0F1115"/>
-          <w:sz w:val="32"/>
-          <w:szCs w:val="32"/>
-          <w:shd w:val="clear" w:color="auto" w:fill="FFFFFF"/>
-          <w:lang w:val="ru-RU"/>
-        </w:rPr>
-        <w:t>МБ</w:t>
+        <w:t>512 КБ</w:t>
       </w:r>
       <w:r>
         <w:rPr>
@@ -1768,6 +1734,8 @@
         </w:rPr>
         <w:t>.</w:t>
       </w:r>
+      <w:bookmarkStart w:id="0" w:name="_GoBack"/>
+      <w:bookmarkEnd w:id="0"/>
     </w:p>
     <w:p>
       <w:pPr>

</xml_diff>